<commit_message>
Update CV document and PDF with ReActify-PDF project and QueryGuard link
</commit_message>
<xml_diff>
--- a/Ahmed_Akram_Amer_CV.docx
+++ b/Ahmed_Akram_Amer_CV.docx
@@ -133,6 +133,139 @@
       <w:pPr>
         <w:spacing w:after="30" w:before="140"/>
       </w:pPr>
+      <w:r/>
+      <w:r>
+        <w:rPr>
+          <w:rFonts w:ascii="Calibri" w:hAnsi="Calibri"/>
+          <w:b/>
+          <w:color w:val="111111"/>
+          <w:sz w:val="20"/>
+        </w:rPr>
+        <w:t>QueryGuard AI – Enterprise Text-to-SQL Platform</w:t>
+      </w:r>
+      <w:r>
+        <w:rPr>
+          <w:rFonts w:ascii="Calibri" w:hAnsi="Calibri"/>
+          <w:color w:val="888888"/>
+          <w:sz w:val="19"/>
+        </w:rPr>
+        <w:t xml:space="preserve"> | </w:t>
+      </w:r>
+      <w:r>
+        <w:rPr>
+          <w:rFonts w:ascii="Calibri" w:hAnsi="Calibri"/>
+          <w:color w:val="0033CC"/>
+          <w:sz w:val="19"/>
+          <w:u w:val="single"/>
+        </w:rPr>
+        <w:t>github.com/Ahmed-7-ML/QueryGuard-AI.git</w:t>
+      </w:r>
+      <w:r>
+        <w:rPr>
+          <w:rFonts w:ascii="Calibri" w:hAnsi="Calibri"/>
+          <w:color w:val="888888"/>
+          <w:sz w:val="19"/>
+        </w:rPr>
+        <w:t xml:space="preserve"> | </w:t>
+      </w:r>
+      <w:r>
+        <w:rPr>
+          <w:rFonts w:ascii="Calibri" w:hAnsi="Calibri"/>
+          <w:i/>
+          <w:color w:val="555555"/>
+          <w:sz w:val="18"/>
+        </w:rPr>
+        <w:t>Python, Gemini 2.5 Flash, Streamlit, SQLite3, RBAC</w:t>
+      </w:r>
+      <w:r>
+        <w:rPr>
+          <w:rFonts w:ascii="Calibri" w:hAnsi="Calibri"/>
+          <w:color w:val="888888"/>
+          <w:sz w:val="18"/>
+        </w:rPr>
+        <w:t xml:space="preserve">  Apr 2025 – Jun 2025</w:t>
+      </w:r>
+    </w:p>
+    <w:p>
+      <w:pPr>
+        <w:pStyle w:val="ListParagraph"/>
+        <w:numPr>
+          <w:ilvl w:val="0"/>
+          <w:numId w:val="2"/>
+        </w:numPr>
+        <w:spacing w:after="40"/>
+      </w:pPr>
+      <w:r>
+        <w:rPr>
+          <w:rFonts w:ascii="Calibri" w:cs="Calibri" w:eastAsia="Calibri" w:hAnsi="Calibri"/>
+          <w:color w:val="333333"/>
+          <w:sz w:val="19"/>
+          <w:szCs w:val="19"/>
+        </w:rPr>
+        <w:t xml:space="preserve">Built an enterprise-grade GenAI platform that translates plain English and Arabic questions into optimized, executable SQL queries with real-time results, enabling data democratization for non-technical business users.</w:t>
+      </w:r>
+    </w:p>
+    <w:p>
+      <w:pPr>
+        <w:pStyle w:val="ListParagraph"/>
+        <w:numPr>
+          <w:ilvl w:val="0"/>
+          <w:numId w:val="2"/>
+        </w:numPr>
+        <w:spacing w:after="40"/>
+      </w:pPr>
+      <w:r>
+        <w:rPr>
+          <w:rFonts w:ascii="Calibri" w:cs="Calibri" w:eastAsia="Calibri" w:hAnsi="Calibri"/>
+          <w:color w:val="333333"/>
+          <w:sz w:val="19"/>
+          <w:szCs w:val="19"/>
+        </w:rPr>
+        <w:t xml:space="preserve">Implemented a Dual-Layer RBAC security system: Admins get full CRUD access while Standard Users are restricted to read-only via SQL Views — with DROP, DELETE, TRUNCATE, and ALTER blocked at both UI and LLM prompt levels.</w:t>
+      </w:r>
+    </w:p>
+    <w:p>
+      <w:pPr>
+        <w:pStyle w:val="ListParagraph"/>
+        <w:numPr>
+          <w:ilvl w:val="0"/>
+          <w:numId w:val="2"/>
+        </w:numPr>
+        <w:spacing w:after="40"/>
+      </w:pPr>
+      <w:r>
+        <w:rPr>
+          <w:rFonts w:ascii="Calibri" w:cs="Calibri" w:eastAsia="Calibri" w:hAnsi="Calibri"/>
+          <w:color w:val="333333"/>
+          <w:sz w:val="19"/>
+          <w:szCs w:val="19"/>
+        </w:rPr>
+        <w:t xml:space="preserve">Designed a decoupled modular architecture (src/auth.py, src/ai_engine.py, src/db_manager.py) supporting one-line migration from SQLite3 to PostgreSQL, MySQL, or Amazon RDS — zero UI changes required.</w:t>
+      </w:r>
+    </w:p>
+    <w:p>
+      <w:pPr>
+        <w:pStyle w:val="ListParagraph"/>
+        <w:numPr>
+          <w:ilvl w:val="0"/>
+          <w:numId w:val="2"/>
+        </w:numPr>
+        <w:spacing w:after="40"/>
+      </w:pPr>
+      <w:r>
+        <w:rPr>
+          <w:rFonts w:ascii="Calibri" w:cs="Calibri" w:eastAsia="Calibri" w:hAnsi="Calibri"/>
+          <w:color w:val="333333"/>
+          <w:sz w:val="19"/>
+          <w:szCs w:val="19"/>
+        </w:rPr>
+        <w:t xml:space="preserve">Powered by the 2026 Google GenAI SDK (Gemini 2.5 Flash), delivering accurate, sanitized SQL generation with schema-aware context injection and injection-resistant system prompting.</w:t>
+      </w:r>
+    </w:p>
+    <w:p>
+      <w:pPr>
+        <w:spacing w:after="30" w:before="140"/>
+      </w:pPr>
       <w:r>
         <w:rPr>
           <w:rFonts w:ascii="Calibri" w:cs="Calibri" w:eastAsia="Calibri" w:hAnsi="Calibri"/>
@@ -142,7 +275,7 @@
           <w:sz w:val="20"/>
           <w:szCs w:val="20"/>
         </w:rPr>
-        <w:t xml:space="preserve">QueryGuard AI — Enterprise Text-to-SQL Platform</w:t>
+        <w:t xml:space="preserve">Multi-Agent Research &amp; Writing System</w:t>
       </w:r>
       <w:r>
         <w:rPr>
@@ -162,7 +295,7 @@
           <w:sz w:val="18"/>
           <w:szCs w:val="18"/>
         </w:rPr>
-        <w:t xml:space="preserve">Python, Gemini 2.5 Flash, Streamlit, SQLite3, RBAC</w:t>
+        <w:t xml:space="preserve">Python, LangGraph, CrewAI, FastAPI, n8n, Groq LLaMA 3.3</w:t>
       </w:r>
       <w:r>
         <w:rPr>
@@ -171,287 +304,178 @@
           <w:sz w:val="18"/>
           <w:szCs w:val="18"/>
         </w:rPr>
-        <w:t xml:space="preserve">  Apr 2025 – Jun 2025</w:t>
-      </w:r>
-    </w:p>
-    <w:p>
-      <w:pPr>
-        <w:pStyle w:val="ListParagraph"/>
-        <w:numPr>
-          <w:ilvl w:val="0"/>
-          <w:numId w:val="2"/>
-        </w:numPr>
-        <w:spacing w:after="40"/>
-      </w:pPr>
-      <w:r>
-        <w:rPr>
-          <w:rFonts w:ascii="Calibri" w:cs="Calibri" w:eastAsia="Calibri" w:hAnsi="Calibri"/>
-          <w:color w:val="333333"/>
-          <w:sz w:val="19"/>
-          <w:szCs w:val="19"/>
-        </w:rPr>
-        <w:t xml:space="preserve">Built an enterprise-grade GenAI platform that translates plain English and Arabic questions into optimized, executable SQL queries with real-time results, enabling data democratization for non-technical business users.</w:t>
-      </w:r>
-    </w:p>
-    <w:p>
-      <w:pPr>
-        <w:pStyle w:val="ListParagraph"/>
-        <w:numPr>
-          <w:ilvl w:val="0"/>
-          <w:numId w:val="2"/>
-        </w:numPr>
-        <w:spacing w:after="40"/>
-      </w:pPr>
-      <w:r>
-        <w:rPr>
-          <w:rFonts w:ascii="Calibri" w:cs="Calibri" w:eastAsia="Calibri" w:hAnsi="Calibri"/>
-          <w:color w:val="333333"/>
-          <w:sz w:val="19"/>
-          <w:szCs w:val="19"/>
-        </w:rPr>
-        <w:t xml:space="preserve">Implemented a Dual-Layer RBAC security system: Admins get full CRUD access while Standard Users are restricted to read-only via SQL Views — with DROP, DELETE, TRUNCATE, and ALTER blocked at both UI and LLM prompt levels.</w:t>
-      </w:r>
-    </w:p>
-    <w:p>
-      <w:pPr>
-        <w:pStyle w:val="ListParagraph"/>
-        <w:numPr>
-          <w:ilvl w:val="0"/>
-          <w:numId w:val="2"/>
-        </w:numPr>
-        <w:spacing w:after="40"/>
-      </w:pPr>
-      <w:r>
-        <w:rPr>
-          <w:rFonts w:ascii="Calibri" w:cs="Calibri" w:eastAsia="Calibri" w:hAnsi="Calibri"/>
-          <w:color w:val="333333"/>
-          <w:sz w:val="19"/>
-          <w:szCs w:val="19"/>
-        </w:rPr>
-        <w:t xml:space="preserve">Designed a decoupled modular architecture (src/auth.py, src/ai_engine.py, src/db_manager.py) supporting one-line migration from SQLite3 to PostgreSQL, MySQL, or Amazon RDS — zero UI changes required.</w:t>
-      </w:r>
-    </w:p>
-    <w:p>
-      <w:pPr>
-        <w:pStyle w:val="ListParagraph"/>
-        <w:numPr>
-          <w:ilvl w:val="0"/>
-          <w:numId w:val="2"/>
-        </w:numPr>
-        <w:spacing w:after="40"/>
-      </w:pPr>
-      <w:r>
-        <w:rPr>
-          <w:rFonts w:ascii="Calibri" w:cs="Calibri" w:eastAsia="Calibri" w:hAnsi="Calibri"/>
-          <w:color w:val="333333"/>
-          <w:sz w:val="19"/>
-          <w:szCs w:val="19"/>
-        </w:rPr>
-        <w:t xml:space="preserve">Powered by the 2026 Google GenAI SDK (Gemini 2.5 Flash), delivering accurate, sanitized SQL generation with schema-aware context injection and injection-resistant system prompting.</w:t>
+        <w:t xml:space="preserve">  Jan 2025 – Mar 2025</w:t>
+      </w:r>
+    </w:p>
+    <w:p>
+      <w:pPr>
+        <w:pStyle w:val="ListParagraph"/>
+        <w:numPr>
+          <w:ilvl w:val="0"/>
+          <w:numId w:val="2"/>
+        </w:numPr>
+        <w:spacing w:after="40"/>
+      </w:pPr>
+      <w:r>
+        <w:rPr>
+          <w:rFonts w:ascii="Calibri" w:cs="Calibri" w:eastAsia="Calibri" w:hAnsi="Calibri"/>
+          <w:color w:val="333333"/>
+          <w:sz w:val="19"/>
+          <w:szCs w:val="19"/>
+        </w:rPr>
+        <w:t xml:space="preserve">Built a multi-agent pipeline that cut manual research time by ~80% and generated structured reports in under 2 minutes, connecting n8n, FastAPI, LangGraph, and CrewAI agents end-to-end.</w:t>
+      </w:r>
+    </w:p>
+    <w:p>
+      <w:pPr>
+        <w:pStyle w:val="ListParagraph"/>
+        <w:numPr>
+          <w:ilvl w:val="0"/>
+          <w:numId w:val="2"/>
+        </w:numPr>
+        <w:spacing w:after="40"/>
+      </w:pPr>
+      <w:r>
+        <w:rPr>
+          <w:rFonts w:ascii="Calibri" w:cs="Calibri" w:eastAsia="Calibri" w:hAnsi="Calibri"/>
+          <w:color w:val="333333"/>
+          <w:sz w:val="19"/>
+          <w:szCs w:val="19"/>
+        </w:rPr>
+        <w:t xml:space="preserve">Designed a router node dynamically dispatching tasks to specialized agents: Research Analyst (SerperDev/Google Search) and Content Writer — with full AgentOps observability across all runs.</w:t>
+      </w:r>
+    </w:p>
+    <w:p>
+      <w:pPr>
+        <w:pStyle w:val="ListParagraph"/>
+        <w:numPr>
+          <w:ilvl w:val="0"/>
+          <w:numId w:val="2"/>
+        </w:numPr>
+        <w:spacing w:after="40"/>
+      </w:pPr>
+      <w:r>
+        <w:rPr>
+          <w:rFonts w:ascii="Calibri" w:cs="Calibri" w:eastAsia="Calibri" w:hAnsi="Calibri"/>
+          <w:color w:val="333333"/>
+          <w:sz w:val="19"/>
+          <w:szCs w:val="19"/>
+        </w:rPr>
+        <w:t xml:space="preserve">Integrated Groq LLaMA 3.3 70B achieving GPT-4-comparable output without API costs; resolved 6+ integration challenges including Poetry cache conflicts and Arabic encoding in n8n.</w:t>
       </w:r>
     </w:p>
     <w:p>
       <w:pPr>
         <w:spacing w:after="30" w:before="140"/>
       </w:pPr>
-      <w:r>
-        <w:rPr>
-          <w:rFonts w:ascii="Calibri" w:cs="Calibri" w:eastAsia="Calibri" w:hAnsi="Calibri"/>
-          <w:b/>
-          <w:bCs/>
+      <w:r/>
+      <w:r>
+        <w:rPr>
+          <w:rFonts w:ascii="Calibri" w:hAnsi="Calibri"/>
+          <w:b/>
           <w:color w:val="111111"/>
           <w:sz w:val="20"/>
-          <w:szCs w:val="20"/>
-        </w:rPr>
-        <w:t xml:space="preserve">Multi-Agent Research &amp; Writing System</w:t>
-      </w:r>
-      <w:r>
-        <w:rPr>
-          <w:rFonts w:ascii="Calibri" w:cs="Calibri" w:eastAsia="Calibri" w:hAnsi="Calibri"/>
+        </w:rPr>
+        <w:t>ReActify-PDF – Enterprise ReAct Agent PDF Chat App</w:t>
+      </w:r>
+      <w:r>
+        <w:rPr>
+          <w:rFonts w:ascii="Calibri" w:hAnsi="Calibri"/>
           <w:color w:val="888888"/>
           <w:sz w:val="19"/>
-          <w:szCs w:val="19"/>
         </w:rPr>
         <w:t xml:space="preserve"> | </w:t>
       </w:r>
       <w:r>
         <w:rPr>
-          <w:rFonts w:ascii="Calibri" w:cs="Calibri" w:eastAsia="Calibri" w:hAnsi="Calibri"/>
+          <w:rFonts w:ascii="Calibri" w:hAnsi="Calibri"/>
+          <w:color w:val="0033CC"/>
+          <w:sz w:val="19"/>
+          <w:u w:val="single"/>
+        </w:rPr>
+        <w:t>github.com/Ahmed-7-ML/ReActify-PDF.git</w:t>
+      </w:r>
+      <w:r>
+        <w:rPr>
+          <w:rFonts w:ascii="Calibri" w:hAnsi="Calibri"/>
+          <w:color w:val="888888"/>
+          <w:sz w:val="19"/>
+        </w:rPr>
+        <w:t xml:space="preserve"> | </w:t>
+      </w:r>
+      <w:r>
+        <w:rPr>
+          <w:rFonts w:ascii="Calibri" w:hAnsi="Calibri"/>
           <w:i/>
-          <w:iCs/>
           <w:color w:val="555555"/>
           <w:sz w:val="18"/>
-          <w:szCs w:val="18"/>
-        </w:rPr>
-        <w:t xml:space="preserve">Python, LangGraph, CrewAI, FastAPI, n8n, Groq LLaMA 3.3</w:t>
-      </w:r>
-      <w:r>
-        <w:rPr>
-          <w:rFonts w:ascii="Calibri" w:cs="Calibri" w:eastAsia="Calibri" w:hAnsi="Calibri"/>
+        </w:rPr>
+        <w:t>React, FastAPI, Qdrant, SQLite, Gemini API, LangChain, Python</w:t>
+      </w:r>
+      <w:r>
+        <w:rPr>
+          <w:rFonts w:ascii="Calibri" w:hAnsi="Calibri"/>
           <w:color w:val="888888"/>
           <w:sz w:val="18"/>
-          <w:szCs w:val="18"/>
-        </w:rPr>
-        <w:t xml:space="preserve">  Jan 2025 – Mar 2025</w:t>
-      </w:r>
-    </w:p>
-    <w:p>
-      <w:pPr>
-        <w:pStyle w:val="ListParagraph"/>
-        <w:numPr>
-          <w:ilvl w:val="0"/>
-          <w:numId w:val="2"/>
-        </w:numPr>
-        <w:spacing w:after="40"/>
-      </w:pPr>
-      <w:r>
-        <w:rPr>
-          <w:rFonts w:ascii="Calibri" w:cs="Calibri" w:eastAsia="Calibri" w:hAnsi="Calibri"/>
-          <w:color w:val="333333"/>
-          <w:sz w:val="19"/>
-          <w:szCs w:val="19"/>
-        </w:rPr>
-        <w:t xml:space="preserve">Built a multi-agent pipeline that cut manual research time by ~80% and generated structured reports in under 2 minutes, connecting n8n, FastAPI, LangGraph, and CrewAI agents end-to-end.</w:t>
-      </w:r>
-    </w:p>
-    <w:p>
-      <w:pPr>
-        <w:pStyle w:val="ListParagraph"/>
-        <w:numPr>
-          <w:ilvl w:val="0"/>
-          <w:numId w:val="2"/>
-        </w:numPr>
-        <w:spacing w:after="40"/>
-      </w:pPr>
-      <w:r>
-        <w:rPr>
-          <w:rFonts w:ascii="Calibri" w:cs="Calibri" w:eastAsia="Calibri" w:hAnsi="Calibri"/>
-          <w:color w:val="333333"/>
-          <w:sz w:val="19"/>
-          <w:szCs w:val="19"/>
-        </w:rPr>
-        <w:t xml:space="preserve">Designed a router node dynamically dispatching tasks to specialized agents: Research Analyst (SerperDev/Google Search) and Content Writer — with full AgentOps observability across all runs.</w:t>
-      </w:r>
-    </w:p>
-    <w:p>
-      <w:pPr>
-        <w:pStyle w:val="ListParagraph"/>
-        <w:numPr>
-          <w:ilvl w:val="0"/>
-          <w:numId w:val="2"/>
-        </w:numPr>
-        <w:spacing w:after="40"/>
-      </w:pPr>
-      <w:r>
-        <w:rPr>
-          <w:rFonts w:ascii="Calibri" w:cs="Calibri" w:eastAsia="Calibri" w:hAnsi="Calibri"/>
-          <w:color w:val="333333"/>
-          <w:sz w:val="19"/>
-          <w:szCs w:val="19"/>
-        </w:rPr>
-        <w:t xml:space="preserve">Integrated Groq LLaMA 3.3 70B achieving GPT-4-comparable output without API costs; resolved 6+ integration challenges including Poetry cache conflicts and Arabic encoding in n8n.</w:t>
-      </w:r>
-    </w:p>
-    <w:p>
-      <w:pPr>
-        <w:spacing w:after="30" w:before="140"/>
-      </w:pPr>
-      <w:r>
-        <w:rPr>
-          <w:rFonts w:ascii="Calibri" w:cs="Calibri" w:eastAsia="Calibri" w:hAnsi="Calibri"/>
-          <w:b/>
-          <w:bCs/>
-          <w:color w:val="111111"/>
-          <w:sz w:val="20"/>
-          <w:szCs w:val="20"/>
-        </w:rPr>
-        <w:t xml:space="preserve">Personal Agentic Assistant — Full-Stack RAG App</w:t>
-      </w:r>
-      <w:r>
-        <w:rPr>
-          <w:rFonts w:ascii="Calibri" w:cs="Calibri" w:eastAsia="Calibri" w:hAnsi="Calibri"/>
-          <w:color w:val="888888"/>
-          <w:sz w:val="19"/>
-          <w:szCs w:val="19"/>
-        </w:rPr>
-        <w:t xml:space="preserve"> | </w:t>
-      </w:r>
-      <w:r>
-        <w:rPr>
-          <w:rFonts w:ascii="Calibri" w:cs="Calibri" w:eastAsia="Calibri" w:hAnsi="Calibri"/>
-          <w:i/>
-          <w:iCs/>
-          <w:color w:val="555555"/>
-          <w:sz w:val="18"/>
-          <w:szCs w:val="18"/>
-        </w:rPr>
-        <w:t xml:space="preserve">Python, FastAPI, LangChain, Pinecone, Google Gemini, Streamlit</w:t>
-      </w:r>
-      <w:r>
-        <w:rPr>
-          <w:rFonts w:ascii="Calibri" w:cs="Calibri" w:eastAsia="Calibri" w:hAnsi="Calibri"/>
-          <w:color w:val="888888"/>
-          <w:sz w:val="18"/>
-          <w:szCs w:val="18"/>
-        </w:rPr>
-        <w:t xml:space="preserve">  Nov 2024 – Jan 2025</w:t>
-      </w:r>
-    </w:p>
-    <w:p>
-      <w:pPr>
-        <w:pStyle w:val="ListParagraph"/>
-        <w:numPr>
-          <w:ilvl w:val="0"/>
-          <w:numId w:val="2"/>
-        </w:numPr>
-        <w:spacing w:after="40"/>
-      </w:pPr>
-      <w:r>
-        <w:rPr>
-          <w:rFonts w:ascii="Calibri" w:cs="Calibri" w:eastAsia="Calibri" w:hAnsi="Calibri"/>
-          <w:color w:val="333333"/>
-          <w:sz w:val="19"/>
-          <w:szCs w:val="19"/>
-        </w:rPr>
-        <w:t xml:space="preserve">Built a full-stack agentic RAG application enabling users to upload PDF documents (50+ pages) and chat with them via a LangChain ReAct agent powered by Gemini 2.5 Flash.</w:t>
-      </w:r>
-    </w:p>
-    <w:p>
-      <w:pPr>
-        <w:pStyle w:val="ListParagraph"/>
-        <w:numPr>
-          <w:ilvl w:val="0"/>
-          <w:numId w:val="2"/>
-        </w:numPr>
-        <w:spacing w:after="40"/>
-      </w:pPr>
-      <w:r>
-        <w:rPr>
-          <w:rFonts w:ascii="Calibri" w:cs="Calibri" w:eastAsia="Calibri" w:hAnsi="Calibri"/>
-          <w:color w:val="333333"/>
-          <w:sz w:val="19"/>
-          <w:szCs w:val="19"/>
-        </w:rPr>
-        <w:t xml:space="preserve">Backend: FastAPI and Pinecone vector database with LangSmith observability, achieving sub-3s response times. Frontend: Streamlit ChatGPT-like interface with real-time upload and multi-turn memory.</w:t>
-      </w:r>
-    </w:p>
-    <w:p>
-      <w:pPr>
-        <w:pStyle w:val="ListParagraph"/>
-        <w:numPr>
-          <w:ilvl w:val="0"/>
-          <w:numId w:val="2"/>
-        </w:numPr>
-        <w:spacing w:after="40"/>
-      </w:pPr>
-      <w:r>
-        <w:rPr>
-          <w:rFonts w:ascii="Calibri" w:cs="Calibri" w:eastAsia="Calibri" w:hAnsi="Calibri"/>
-          <w:color w:val="333333"/>
-          <w:sz w:val="19"/>
-          <w:szCs w:val="19"/>
-        </w:rPr>
-        <w:t xml:space="preserve">Implemented CI/CD pipelines with GitHub Actions to automate testing and deployment of the FastAPI backend.</w:t>
+        </w:rPr>
+        <w:t xml:space="preserve">  May 2026 – Jun 2026</w:t>
+      </w:r>
+    </w:p>
+    <w:p>
+      <w:pPr>
+        <w:pStyle w:val="ListParagraph"/>
+        <w:numPr>
+          <w:ilvl w:val="0"/>
+          <w:numId w:val="2"/>
+        </w:numPr>
+        <w:spacing w:after="40"/>
+      </w:pPr>
+      <w:r>
+        <w:rPr>
+          <w:rFonts w:ascii="Calibri" w:cs="Calibri" w:eastAsia="Calibri" w:hAnsi="Calibri"/>
+          <w:color w:val="333333"/>
+          <w:sz w:val="19"/>
+          <w:szCs w:val="19"/>
+        </w:rPr>
+        <w:t>Engineered a bilingual (English/Arabic) agentic PDF chatting application utilizing the ReAct agent framework via Google Gemini API to autonomously reason and synthesize source-attributed answers.</w:t>
+      </w:r>
+    </w:p>
+    <w:p>
+      <w:pPr>
+        <w:pStyle w:val="ListParagraph"/>
+        <w:numPr>
+          <w:ilvl w:val="0"/>
+          <w:numId w:val="2"/>
+        </w:numPr>
+        <w:spacing w:after="40"/>
+      </w:pPr>
+      <w:r>
+        <w:rPr>
+          <w:rFonts w:ascii="Calibri" w:cs="Calibri" w:eastAsia="Calibri" w:hAnsi="Calibri"/>
+          <w:color w:val="333333"/>
+          <w:sz w:val="19"/>
+          <w:szCs w:val="19"/>
+        </w:rPr>
+        <w:t>Built a high-performance ingestion pipeline that generates embeddings and indexes documents into a local, SQLite-backed Qdrant vector database in seconds.</w:t>
+      </w:r>
+    </w:p>
+    <w:p>
+      <w:pPr>
+        <w:pStyle w:val="ListParagraph"/>
+        <w:numPr>
+          <w:ilvl w:val="0"/>
+          <w:numId w:val="2"/>
+        </w:numPr>
+        <w:spacing w:after="40"/>
+      </w:pPr>
+      <w:r>
+        <w:rPr>
+          <w:rFonts w:ascii="Calibri" w:cs="Calibri" w:eastAsia="Calibri" w:hAnsi="Calibri"/>
+          <w:color w:val="333333"/>
+          <w:sz w:val="19"/>
+          <w:szCs w:val="19"/>
+        </w:rPr>
+        <w:t>Optimized system performance using a single connection instance for lock-free SQLite ingestion and implemented immediate garbage collection of database locks on document upload.</w:t>
       </w:r>
     </w:p>
     <w:p>

</xml_diff>